<commit_message>
Addition of json files for moves
</commit_message>
<xml_diff>
--- a/Objectives.docx
+++ b/Objectives.docx
@@ -235,6 +235,26 @@
       <w:pPr>
         <w:pStyle w:val="ListParagraph"/>
         <w:numPr>
+          <w:ilvl w:val="2"/>
+          <w:numId w:val="5"/>
+        </w:numPr>
+      </w:pPr>
+      <w:r>
+        <w:t>Menu screen + the ability to pick characters by the movement keys (“</w:t>
+      </w:r>
+      <w:proofErr w:type="spellStart"/>
+      <w:r>
+        <w:t>wasd</w:t>
+      </w:r>
+      <w:proofErr w:type="spellEnd"/>
+      <w:r>
+        <w:t>” or arrows)</w:t>
+      </w:r>
+    </w:p>
+    <w:p>
+      <w:pPr>
+        <w:pStyle w:val="ListParagraph"/>
+        <w:numPr>
           <w:ilvl w:val="1"/>
           <w:numId w:val="5"/>
         </w:numPr>
@@ -412,6 +432,7 @@
         </w:numPr>
       </w:pPr>
       <w:r>
+        <w:lastRenderedPageBreak/>
         <w:t>Walk</w:t>
       </w:r>
     </w:p>
@@ -436,7 +457,6 @@
         </w:numPr>
       </w:pPr>
       <w:r>
-        <w:lastRenderedPageBreak/>
         <w:t>Dash/Dodge</w:t>
       </w:r>
     </w:p>
@@ -694,10 +714,7 @@
         <w:t xml:space="preserve">: </w:t>
       </w:r>
       <w:r>
-        <w:t>Rushdown</w:t>
-      </w:r>
-      <w:r>
-        <w:t xml:space="preserve">, </w:t>
+        <w:t xml:space="preserve">Rushdown, </w:t>
       </w:r>
       <w:r>
         <w:t>Brawler,</w:t>

</xml_diff>